<commit_message>
upload file code slot 2
</commit_message>
<xml_diff>
--- a/slot1/EX_01.docx
+++ b/slot1/EX_01.docx
@@ -379,17 +379,10 @@
         <w:spacing w:after="80"/>
       </w:pPr>
       <w:r>
-        <w:rPr>
-          <w:rFonts w:ascii="Courier New" w:eastAsia="Courier New" w:hAnsi="Courier New" w:cs="Courier New"/>
-          <w:b/>
-          <w:bCs/>
-          <w:sz w:val="22"/>
-          <w:szCs w:val="22"/>
-        </w:rPr>
-        <w:t>@Entity</w:t>
-      </w:r>
-      <w:r>
-        <w:t>: Đánh dấu một Class là một thực thể cần lưu vào database.</w:t>
+        <w:t>@Entity: Đ</w:t>
+      </w:r>
+      <w:r>
+        <w:t>ánh dấu một Class là một thực thể cần lưu vào database.</w:t>
       </w:r>
     </w:p>
     <w:p>
@@ -402,17 +395,10 @@
         <w:spacing w:after="80"/>
       </w:pPr>
       <w:r>
-        <w:rPr>
-          <w:rFonts w:ascii="Courier New" w:eastAsia="Courier New" w:hAnsi="Courier New" w:cs="Courier New"/>
-          <w:b/>
-          <w:bCs/>
-          <w:sz w:val="22"/>
-          <w:szCs w:val="22"/>
-        </w:rPr>
-        <w:t>@Table(name = "users")</w:t>
-      </w:r>
-      <w:r>
-        <w:t>: Chỉ định tên bảng tương ứng.</w:t>
+        <w:t xml:space="preserve">@Table(name = “users”): </w:t>
+      </w:r>
+      <w:r>
+        <w:t>Chỉ định tên bảng tương ứng.</w:t>
       </w:r>
     </w:p>
     <w:p>
@@ -425,17 +411,10 @@
         <w:spacing w:after="80"/>
       </w:pPr>
       <w:r>
-        <w:rPr>
-          <w:rFonts w:ascii="Courier New" w:eastAsia="Courier New" w:hAnsi="Courier New" w:cs="Courier New"/>
-          <w:b/>
-          <w:bCs/>
-          <w:sz w:val="22"/>
-          <w:szCs w:val="22"/>
-        </w:rPr>
-        <w:t>@Id</w:t>
-      </w:r>
-      <w:r>
-        <w:t>: Đánh dấu thuộc tính là Khóa chính (Primary Key).</w:t>
+        <w:t xml:space="preserve">@Id: </w:t>
+      </w:r>
+      <w:r>
+        <w:t>Đánh dấu thuộc tính là Khóa chính (Primary Key).</w:t>
       </w:r>
     </w:p>
     <w:p>
@@ -448,17 +427,10 @@
         <w:spacing w:after="360"/>
       </w:pPr>
       <w:r>
-        <w:rPr>
-          <w:rFonts w:ascii="Courier New" w:eastAsia="Courier New" w:hAnsi="Courier New" w:cs="Courier New"/>
-          <w:b/>
-          <w:bCs/>
-          <w:sz w:val="22"/>
-          <w:szCs w:val="22"/>
-        </w:rPr>
-        <w:t>@Column</w:t>
-      </w:r>
-      <w:r>
-        <w:t>: Ánh xạ thuộc tính với một cột cụ thể.</w:t>
+        <w:t xml:space="preserve">@Column: </w:t>
+      </w:r>
+      <w:r>
+        <w:t>Ánh xạ thuộc tính với một cột cụ thể.</w:t>
       </w:r>
     </w:p>
     <w:p>
@@ -530,16 +502,298 @@
             <w14:round/>
           </w14:textOutline>
         </w:rPr>
+        <w:t>2.1. Khái niệm Java Spring Framework</w:t>
+      </w:r>
+    </w:p>
+    <w:p>
+      <w:pPr>
+        <w:spacing w:after="120"/>
+      </w:pPr>
+      <w:r>
+        <w:t>Spring Framework là một nền tảng mã nguồn mở (open-source) cực kỳ phổ biến và mạnh mẽ dành cho hệ sinh thái Java. Nó cung cấp cơ sở hạ tầng toàn diện để xây dựng các ứng dụng từ web cơ bản đến hệ thống doanh nghiệp (enterprise) và microservices quy mô lớn, một cách nhanh chóng, an toàn và dễ bảo trì.</w:t>
+      </w:r>
+    </w:p>
+    <w:p>
+      <w:pPr>
+        <w:spacing w:after="200"/>
+      </w:pPr>
+      <w:r>
+        <w:t>Thay vì phải tự cấu hình thủ công các đoạn code để quản lý kết nối database, xử lý HTTP request hay cấu hình bảo mật, Spring cung cấp sẵn các module đã được tối ưu, giúp lập trình viên tập trung vào việc viết Business Logic cốt lõi.</w:t>
+      </w:r>
+    </w:p>
+    <w:p>
+      <w:pPr>
+        <w:pStyle w:val="Heading2"/>
+        <w:rPr>
+          <w:bCs w:val="0"/>
+          <w:color w:val="000000" w:themeColor="text1"/>
+          <w14:shadow w14:blurRad="38100" w14:dist="19050" w14:dir="2700000" w14:sx="100000" w14:sy="100000" w14:kx="0" w14:ky="0" w14:algn="tl">
+            <w14:schemeClr w14:val="dk1">
+              <w14:alpha w14:val="60000"/>
+            </w14:schemeClr>
+          </w14:shadow>
+          <w14:textOutline w14:w="0" w14:cap="flat" w14:cmpd="sng" w14:algn="ctr">
+            <w14:noFill/>
+            <w14:prstDash w14:val="solid"/>
+            <w14:round/>
+          </w14:textOutline>
+        </w:rPr>
+      </w:pPr>
+      <w:r>
+        <w:rPr>
+          <w:bCs w:val="0"/>
+          <w:color w:val="000000" w:themeColor="text1"/>
+          <w14:shadow w14:blurRad="38100" w14:dist="19050" w14:dir="2700000" w14:sx="100000" w14:sy="100000" w14:kx="0" w14:ky="0" w14:algn="tl">
+            <w14:schemeClr w14:val="dk1">
+              <w14:alpha w14:val="60000"/>
+            </w14:schemeClr>
+          </w14:shadow>
+          <w14:textOutline w14:w="0" w14:cap="flat" w14:cmpd="sng" w14:algn="ctr">
+            <w14:noFill/>
+            <w14:prstDash w14:val="solid"/>
+            <w14:round/>
+          </w14:textOutline>
+        </w:rPr>
+        <w:t>2.2. Khái niệm Spring Boot</w:t>
+      </w:r>
+    </w:p>
+    <w:p>
+      <w:pPr>
+        <w:spacing w:after="120"/>
+      </w:pPr>
+      <w:r>
+        <w:t>Spring Boot là một công cụ (framework con) được xây dựng dựa trên nền tảng của Spring Framework. Mục tiêu của nó là giúp tạo ra các ứng dụng Java có thể chạy ngay lập tức (production-ready) với thời gian và công sức cấu hình ít nhất có thể.</w:t>
+      </w:r>
+    </w:p>
+    <w:p>
+      <w:pPr>
+        <w:spacing w:after="200"/>
+      </w:pPr>
+      <w:r>
+        <w:t>Ví von dễ hiểu: Nếu Spring Framework là một xưởng cơ khí cung cấp hàng ngàn linh kiện để tự thiết kế và lắp ráp ô tô, thì Spring Boot chính là chiếc ô tô đã được lắp ráp sẵn những phần thiết yếu nhất – bạn chỉ cần "đổ xăng" (viết logic nghiệp vụ) và lái đi.</w:t>
+      </w:r>
+    </w:p>
+    <w:p>
+      <w:pPr>
+        <w:pStyle w:val="Heading2"/>
+        <w:rPr>
+          <w:bCs w:val="0"/>
+          <w:color w:val="000000" w:themeColor="text1"/>
+          <w14:shadow w14:blurRad="38100" w14:dist="19050" w14:dir="2700000" w14:sx="100000" w14:sy="100000" w14:kx="0" w14:ky="0" w14:algn="tl">
+            <w14:schemeClr w14:val="dk1">
+              <w14:alpha w14:val="60000"/>
+            </w14:schemeClr>
+          </w14:shadow>
+          <w14:textOutline w14:w="0" w14:cap="flat" w14:cmpd="sng" w14:algn="ctr">
+            <w14:noFill/>
+            <w14:prstDash w14:val="solid"/>
+            <w14:round/>
+          </w14:textOutline>
+        </w:rPr>
+      </w:pPr>
+      <w:r>
+        <w:rPr>
+          <w:bCs w:val="0"/>
+          <w:color w:val="000000" w:themeColor="text1"/>
+          <w14:shadow w14:blurRad="38100" w14:dist="19050" w14:dir="2700000" w14:sx="100000" w14:sy="100000" w14:kx="0" w14:ky="0" w14:algn="tl">
+            <w14:schemeClr w14:val="dk1">
+              <w14:alpha w14:val="60000"/>
+            </w14:schemeClr>
+          </w14:shadow>
+          <w14:textOutline w14:w="0" w14:cap="flat" w14:cmpd="sng" w14:algn="ctr">
+            <w14:noFill/>
+            <w14:prstDash w14:val="solid"/>
+            <w14:round/>
+          </w14:textOutline>
+        </w:rPr>
+        <w:t>2.3. Phân biệt Java Spring Framework và Spring Boot</w:t>
+      </w:r>
+    </w:p>
+    <w:p>
+      <w:pPr>
+        <w:spacing w:after="80"/>
+      </w:pPr>
+      <w:r>
+        <w:rPr>
+          <w:b/>
+          <w:bCs/>
+        </w:rPr>
+        <w:t>Mức độ cấu hình:</w:t>
+      </w:r>
+    </w:p>
+    <w:p>
+      <w:pPr>
+        <w:pStyle w:val="ListParagraph"/>
+        <w:numPr>
+          <w:ilvl w:val="0"/>
+          <w:numId w:val="2"/>
+        </w:numPr>
+        <w:spacing w:after="60"/>
+      </w:pPr>
+      <w:r>
+        <w:t>Spring Framework yêu cầu cấu hình nhiều (XML hoặc annotation) cho từng thành phần.</w:t>
+      </w:r>
+    </w:p>
+    <w:p>
+      <w:pPr>
+        <w:pStyle w:val="ListParagraph"/>
+        <w:numPr>
+          <w:ilvl w:val="0"/>
+          <w:numId w:val="2"/>
+        </w:numPr>
+        <w:spacing w:after="140"/>
+      </w:pPr>
+      <w:r>
+        <w:t>Spring Boot áp dụng nguyên tắc "Auto-configuration" – tự động cấu hình dựa trên các dependency có trong project.</w:t>
+      </w:r>
+    </w:p>
+    <w:p>
+      <w:pPr>
+        <w:spacing w:after="80"/>
+      </w:pPr>
+      <w:r>
+        <w:rPr>
+          <w:b/>
+          <w:bCs/>
+        </w:rPr>
+        <w:t>Server nhúng (Embedded Server):</w:t>
+      </w:r>
+    </w:p>
+    <w:p>
+      <w:pPr>
+        <w:pStyle w:val="ListParagraph"/>
+        <w:numPr>
+          <w:ilvl w:val="0"/>
+          <w:numId w:val="2"/>
+        </w:numPr>
+        <w:spacing w:after="60"/>
+      </w:pPr>
+      <w:r>
+        <w:t>Spring Framework cần deploy lên server ngoài (Tomcat, JBoss, ...).</w:t>
+      </w:r>
+    </w:p>
+    <w:p>
+      <w:pPr>
+        <w:pStyle w:val="ListParagraph"/>
+        <w:numPr>
+          <w:ilvl w:val="0"/>
+          <w:numId w:val="2"/>
+        </w:numPr>
+        <w:spacing w:after="140"/>
+      </w:pPr>
+      <w:r>
+        <w:t>Spring Boot tích hợp sẵn server nhúng (embedded Tomcat/Jetty), chạy trực tiếp bằng lệnh java -jar.</w:t>
+      </w:r>
+    </w:p>
+    <w:p>
+      <w:pPr>
+        <w:spacing w:after="80"/>
+      </w:pPr>
+      <w:r>
+        <w:rPr>
+          <w:b/>
+          <w:bCs/>
+        </w:rPr>
+        <w:t>Phạm vi sử dụng:</w:t>
+      </w:r>
+    </w:p>
+    <w:p>
+      <w:pPr>
+        <w:pStyle w:val="ListParagraph"/>
+        <w:numPr>
+          <w:ilvl w:val="0"/>
+          <w:numId w:val="2"/>
+        </w:numPr>
+        <w:spacing w:after="60"/>
+      </w:pPr>
+      <w:r>
+        <w:t>Spring Framework phù hợp với các dự án cần kiểm soát chi tiết từng cấu hình.</w:t>
+      </w:r>
+    </w:p>
+    <w:p>
+      <w:pPr>
+        <w:pStyle w:val="ListParagraph"/>
+        <w:numPr>
+          <w:ilvl w:val="0"/>
+          <w:numId w:val="2"/>
+        </w:numPr>
+        <w:spacing w:after="360"/>
+      </w:pPr>
+      <w:r>
+        <w:t>Spring Boot phù hợp khi muốn khởi tạo nhanh, ít cấu hình, đặc biệt cho microservices và REST API.</w:t>
+      </w:r>
+    </w:p>
+    <w:p>
+      <w:pPr>
+        <w:pStyle w:val="Heading1"/>
+        <w:rPr>
+          <w:bCs w:val="0"/>
+          <w:color w:val="000000" w:themeColor="text1"/>
+          <w14:shadow w14:blurRad="38100" w14:dist="19050" w14:dir="2700000" w14:sx="100000" w14:sy="100000" w14:kx="0" w14:ky="0" w14:algn="tl">
+            <w14:schemeClr w14:val="dk1">
+              <w14:alpha w14:val="60000"/>
+            </w14:schemeClr>
+          </w14:shadow>
+          <w14:textOutline w14:w="0" w14:cap="flat" w14:cmpd="sng" w14:algn="ctr">
+            <w14:noFill/>
+            <w14:prstDash w14:val="solid"/>
+            <w14:round/>
+          </w14:textOutline>
+        </w:rPr>
+      </w:pPr>
+      <w:r>
+        <w:rPr>
+          <w:bCs w:val="0"/>
+          <w:color w:val="000000" w:themeColor="text1"/>
+          <w14:shadow w14:blurRad="38100" w14:dist="19050" w14:dir="2700000" w14:sx="100000" w14:sy="100000" w14:kx="0" w14:ky="0" w14:algn="tl">
+            <w14:schemeClr w14:val="dk1">
+              <w14:alpha w14:val="60000"/>
+            </w14:schemeClr>
+          </w14:shadow>
+          <w14:textOutline w14:w="0" w14:cap="flat" w14:cmpd="sng" w14:algn="ctr">
+            <w14:noFill/>
+            <w14:prstDash w14:val="solid"/>
+            <w14:round/>
+          </w14:textOutline>
+        </w:rPr>
+        <w:t>3. Git</w:t>
+      </w:r>
+    </w:p>
+    <w:p>
+      <w:pPr>
+        <w:pStyle w:val="Heading2"/>
+        <w:rPr>
+          <w:bCs w:val="0"/>
+          <w:color w:val="000000" w:themeColor="text1"/>
+          <w14:shadow w14:blurRad="38100" w14:dist="19050" w14:dir="2700000" w14:sx="100000" w14:sy="100000" w14:kx="0" w14:ky="0" w14:algn="tl">
+            <w14:schemeClr w14:val="dk1">
+              <w14:alpha w14:val="60000"/>
+            </w14:schemeClr>
+          </w14:shadow>
+          <w14:textOutline w14:w="0" w14:cap="flat" w14:cmpd="sng" w14:algn="ctr">
+            <w14:noFill/>
+            <w14:prstDash w14:val="solid"/>
+            <w14:round/>
+          </w14:textOutline>
+        </w:rPr>
+      </w:pPr>
+      <w:r>
+        <w:rPr>
+          <w:bCs w:val="0"/>
+          <w:color w:val="000000" w:themeColor="text1"/>
+          <w14:shadow w14:blurRad="38100" w14:dist="19050" w14:dir="2700000" w14:sx="100000" w14:sy="100000" w14:kx="0" w14:ky="0" w14:algn="tl">
+            <w14:schemeClr w14:val="dk1">
+              <w14:alpha w14:val="60000"/>
+            </w14:schemeClr>
+          </w14:shadow>
+          <w14:textOutline w14:w="0" w14:cap="flat" w14:cmpd="sng" w14:algn="ctr">
+            <w14:noFill/>
+            <w14:prstDash w14:val="solid"/>
+            <w14:round/>
+          </w14:textOutline>
+        </w:rPr>
         <w:lastRenderedPageBreak/>
-        <w:t>2.1. Khái niệm Java Spring Framework</w:t>
-      </w:r>
-    </w:p>
-    <w:p>
-      <w:pPr>
-        <w:spacing w:after="120"/>
-      </w:pPr>
-      <w:r>
-        <w:t>Spring Framework là một nền tảng mã nguồn mở (open-source) cực kỳ phổ biến và mạnh mẽ dành cho hệ sinh thái Java. Nó cung cấp cơ sở hạ tầng toàn diện để xây dựng các ứng dụng từ web cơ bản đến hệ thống doanh nghiệp (enterprise) và microservices quy mô lớn, một cách nhanh chóng, an toàn và dễ bảo trì.</w:t>
+        <w:t>3.1. Khái niệm Git</w:t>
       </w:r>
     </w:p>
     <w:p>
@@ -547,7 +801,7 @@
         <w:spacing w:after="200"/>
       </w:pPr>
       <w:r>
-        <w:t>Thay vì phải tự cấu hình thủ công các đoạn code để quản lý kết nối database, xử lý HTTP request hay cấu hình bảo mật, Spring cung cấp sẵn các module đã được tối ưu, giúp lập trình viên tập trung vào việc viết Business Logic cốt lõi.</w:t>
+        <w:t>Git là một công cụ phần mềm giúp theo dõi và quản lý các sự thay đổi của mã nguồn (code) trong quá trình phát triển phần mềm. Đây là một Hệ thống Quản lý Phiên bản Phân tán (Distributed Version Control System – DVCS), cho phép nhiều lập trình viên cộng tác trên cùng một dự án một cách hiệu quả.</w:t>
       </w:r>
     </w:p>
     <w:p>
@@ -583,63 +837,16 @@
             <w14:round/>
           </w14:textOutline>
         </w:rPr>
-        <w:t>2.2. Khái niệm Spring Boot</w:t>
-      </w:r>
-    </w:p>
-    <w:p>
-      <w:pPr>
-        <w:spacing w:after="120"/>
-      </w:pPr>
-      <w:r>
-        <w:t>Spring Boot là một công cụ (framework con) được xây dựng dựa trên nền tảng của Spring Framework. Mục tiêu của nó là giúp tạo ra các ứng dụng Java có thể chạy ngay lập tức (production-ready) với thời gian và công sức cấu hình ít nhất có thể.</w:t>
-      </w:r>
-    </w:p>
-    <w:p>
-      <w:pPr>
-        <w:spacing w:after="200"/>
-      </w:pPr>
-      <w:r>
-        <w:t>Ví von dễ hiểu: Nếu Spring Framework là một xưởng cơ khí cung cấp hàng ngàn linh kiện để tự thiết kế và lắp ráp ô tô, thì Spring Boot chính là chiếc ô tô đã được lắp ráp sẵn những phần thiết yếu nhất – bạn chỉ cần "đổ xăng" (viết logic nghiệp vụ) và lái đi.</w:t>
-      </w:r>
-    </w:p>
-    <w:p>
-      <w:pPr>
-        <w:pStyle w:val="Heading2"/>
-        <w:rPr>
-          <w:bCs w:val="0"/>
-          <w:color w:val="000000" w:themeColor="text1"/>
-          <w14:shadow w14:blurRad="38100" w14:dist="19050" w14:dir="2700000" w14:sx="100000" w14:sy="100000" w14:kx="0" w14:ky="0" w14:algn="tl">
-            <w14:schemeClr w14:val="dk1">
-              <w14:alpha w14:val="60000"/>
-            </w14:schemeClr>
-          </w14:shadow>
-          <w14:textOutline w14:w="0" w14:cap="flat" w14:cmpd="sng" w14:algn="ctr">
-            <w14:noFill/>
-            <w14:prstDash w14:val="solid"/>
-            <w14:round/>
-          </w14:textOutline>
-        </w:rPr>
-      </w:pPr>
-      <w:r>
-        <w:rPr>
-          <w:bCs w:val="0"/>
-          <w:color w:val="000000" w:themeColor="text1"/>
-          <w14:shadow w14:blurRad="38100" w14:dist="19050" w14:dir="2700000" w14:sx="100000" w14:sy="100000" w14:kx="0" w14:ky="0" w14:algn="tl">
-            <w14:schemeClr w14:val="dk1">
-              <w14:alpha w14:val="60000"/>
-            </w14:schemeClr>
-          </w14:shadow>
-          <w14:textOutline w14:w="0" w14:cap="flat" w14:cmpd="sng" w14:algn="ctr">
-            <w14:noFill/>
-            <w14:prstDash w14:val="solid"/>
-            <w14:round/>
-          </w14:textOutline>
-        </w:rPr>
-        <w:t>2.3. Phân biệt Java Spring Framework và Spring Boot</w:t>
-      </w:r>
-    </w:p>
-    <w:p>
-      <w:pPr>
+        <w:t>3.2. Các khái niệm cốt lõi của Git</w:t>
+      </w:r>
+    </w:p>
+    <w:p>
+      <w:pPr>
+        <w:pStyle w:val="ListParagraph"/>
+        <w:numPr>
+          <w:ilvl w:val="0"/>
+          <w:numId w:val="2"/>
+        </w:numPr>
         <w:spacing w:after="80"/>
       </w:pPr>
       <w:r>
@@ -647,242 +854,6 @@
           <w:b/>
           <w:bCs/>
         </w:rPr>
-        <w:t>Mức độ cấu hình:</w:t>
-      </w:r>
-    </w:p>
-    <w:p>
-      <w:pPr>
-        <w:pStyle w:val="ListParagraph"/>
-        <w:numPr>
-          <w:ilvl w:val="0"/>
-          <w:numId w:val="2"/>
-        </w:numPr>
-        <w:spacing w:after="60"/>
-      </w:pPr>
-      <w:r>
-        <w:t>Spring Framework yêu cầu cấu hình nhiều (XML hoặc annotation) cho từng thành phần.</w:t>
-      </w:r>
-    </w:p>
-    <w:p>
-      <w:pPr>
-        <w:pStyle w:val="ListParagraph"/>
-        <w:numPr>
-          <w:ilvl w:val="0"/>
-          <w:numId w:val="2"/>
-        </w:numPr>
-        <w:spacing w:after="140"/>
-      </w:pPr>
-      <w:r>
-        <w:t>Spring Boot áp dụng nguyên tắc "Auto-configuration" – tự động cấu hình dựa trên các dependency có trong project.</w:t>
-      </w:r>
-    </w:p>
-    <w:p>
-      <w:pPr>
-        <w:spacing w:after="80"/>
-      </w:pPr>
-      <w:r>
-        <w:rPr>
-          <w:b/>
-          <w:bCs/>
-        </w:rPr>
-        <w:t>Server nhúng (Embedded Server):</w:t>
-      </w:r>
-    </w:p>
-    <w:p>
-      <w:pPr>
-        <w:pStyle w:val="ListParagraph"/>
-        <w:numPr>
-          <w:ilvl w:val="0"/>
-          <w:numId w:val="2"/>
-        </w:numPr>
-        <w:spacing w:after="60"/>
-      </w:pPr>
-      <w:r>
-        <w:t>Spring Framework cần deploy lên server ngoài (Tomcat, JBoss, ...).</w:t>
-      </w:r>
-    </w:p>
-    <w:p>
-      <w:pPr>
-        <w:pStyle w:val="ListParagraph"/>
-        <w:numPr>
-          <w:ilvl w:val="0"/>
-          <w:numId w:val="2"/>
-        </w:numPr>
-        <w:spacing w:after="140"/>
-      </w:pPr>
-      <w:r>
-        <w:t>Spring Boot tích hợp sẵn server nhúng (embedded Tomcat/Jetty), chạy trực tiếp bằng lệnh java -jar.</w:t>
-      </w:r>
-    </w:p>
-    <w:p>
-      <w:pPr>
-        <w:spacing w:after="80"/>
-      </w:pPr>
-      <w:r>
-        <w:rPr>
-          <w:b/>
-          <w:bCs/>
-        </w:rPr>
-        <w:t>Phạm vi sử dụng:</w:t>
-      </w:r>
-    </w:p>
-    <w:p>
-      <w:pPr>
-        <w:pStyle w:val="ListParagraph"/>
-        <w:numPr>
-          <w:ilvl w:val="0"/>
-          <w:numId w:val="2"/>
-        </w:numPr>
-        <w:spacing w:after="60"/>
-      </w:pPr>
-      <w:r>
-        <w:t>Spring Framework phù hợp với các dự án cần kiểm soát chi tiết từng cấu hình.</w:t>
-      </w:r>
-    </w:p>
-    <w:p>
-      <w:pPr>
-        <w:pStyle w:val="ListParagraph"/>
-        <w:numPr>
-          <w:ilvl w:val="0"/>
-          <w:numId w:val="2"/>
-        </w:numPr>
-        <w:spacing w:after="360"/>
-      </w:pPr>
-      <w:r>
-        <w:t>Spring Boot phù hợp khi muốn khởi tạo nhanh, ít cấu hình, đặc biệt cho microservices và REST API.</w:t>
-      </w:r>
-    </w:p>
-    <w:p>
-      <w:pPr>
-        <w:pStyle w:val="Heading1"/>
-        <w:rPr>
-          <w:bCs w:val="0"/>
-          <w:color w:val="000000" w:themeColor="text1"/>
-          <w14:shadow w14:blurRad="38100" w14:dist="19050" w14:dir="2700000" w14:sx="100000" w14:sy="100000" w14:kx="0" w14:ky="0" w14:algn="tl">
-            <w14:schemeClr w14:val="dk1">
-              <w14:alpha w14:val="60000"/>
-            </w14:schemeClr>
-          </w14:shadow>
-          <w14:textOutline w14:w="0" w14:cap="flat" w14:cmpd="sng" w14:algn="ctr">
-            <w14:noFill/>
-            <w14:prstDash w14:val="solid"/>
-            <w14:round/>
-          </w14:textOutline>
-        </w:rPr>
-      </w:pPr>
-      <w:r>
-        <w:rPr>
-          <w:bCs w:val="0"/>
-          <w:color w:val="000000" w:themeColor="text1"/>
-          <w14:shadow w14:blurRad="38100" w14:dist="19050" w14:dir="2700000" w14:sx="100000" w14:sy="100000" w14:kx="0" w14:ky="0" w14:algn="tl">
-            <w14:schemeClr w14:val="dk1">
-              <w14:alpha w14:val="60000"/>
-            </w14:schemeClr>
-          </w14:shadow>
-          <w14:textOutline w14:w="0" w14:cap="flat" w14:cmpd="sng" w14:algn="ctr">
-            <w14:noFill/>
-            <w14:prstDash w14:val="solid"/>
-            <w14:round/>
-          </w14:textOutline>
-        </w:rPr>
-        <w:t>3. Git</w:t>
-      </w:r>
-    </w:p>
-    <w:p>
-      <w:pPr>
-        <w:pStyle w:val="Heading2"/>
-        <w:rPr>
-          <w:bCs w:val="0"/>
-          <w:color w:val="000000" w:themeColor="text1"/>
-          <w14:shadow w14:blurRad="38100" w14:dist="19050" w14:dir="2700000" w14:sx="100000" w14:sy="100000" w14:kx="0" w14:ky="0" w14:algn="tl">
-            <w14:schemeClr w14:val="dk1">
-              <w14:alpha w14:val="60000"/>
-            </w14:schemeClr>
-          </w14:shadow>
-          <w14:textOutline w14:w="0" w14:cap="flat" w14:cmpd="sng" w14:algn="ctr">
-            <w14:noFill/>
-            <w14:prstDash w14:val="solid"/>
-            <w14:round/>
-          </w14:textOutline>
-        </w:rPr>
-      </w:pPr>
-      <w:r>
-        <w:rPr>
-          <w:bCs w:val="0"/>
-          <w:color w:val="000000" w:themeColor="text1"/>
-          <w14:shadow w14:blurRad="38100" w14:dist="19050" w14:dir="2700000" w14:sx="100000" w14:sy="100000" w14:kx="0" w14:ky="0" w14:algn="tl">
-            <w14:schemeClr w14:val="dk1">
-              <w14:alpha w14:val="60000"/>
-            </w14:schemeClr>
-          </w14:shadow>
-          <w14:textOutline w14:w="0" w14:cap="flat" w14:cmpd="sng" w14:algn="ctr">
-            <w14:noFill/>
-            <w14:prstDash w14:val="solid"/>
-            <w14:round/>
-          </w14:textOutline>
-        </w:rPr>
-        <w:t>3.1. Khái niệm Git</w:t>
-      </w:r>
-    </w:p>
-    <w:p>
-      <w:pPr>
-        <w:spacing w:after="200"/>
-      </w:pPr>
-      <w:r>
-        <w:t>Git là một công cụ phần mềm giúp theo dõi và quản lý các sự thay đổi của mã nguồn (code) trong quá trình phát triển phần mềm. Đây là một Hệ thống Quản lý Phiên bản Phân tán (Distributed Version Control System – DVCS), cho phép nhiều lập trình viên cộng tác trên cùng một dự án một cách hiệu quả.</w:t>
-      </w:r>
-    </w:p>
-    <w:p>
-      <w:pPr>
-        <w:pStyle w:val="Heading2"/>
-        <w:rPr>
-          <w:bCs w:val="0"/>
-          <w:color w:val="000000" w:themeColor="text1"/>
-          <w14:shadow w14:blurRad="38100" w14:dist="19050" w14:dir="2700000" w14:sx="100000" w14:sy="100000" w14:kx="0" w14:ky="0" w14:algn="tl">
-            <w14:schemeClr w14:val="dk1">
-              <w14:alpha w14:val="60000"/>
-            </w14:schemeClr>
-          </w14:shadow>
-          <w14:textOutline w14:w="0" w14:cap="flat" w14:cmpd="sng" w14:algn="ctr">
-            <w14:noFill/>
-            <w14:prstDash w14:val="solid"/>
-            <w14:round/>
-          </w14:textOutline>
-        </w:rPr>
-      </w:pPr>
-      <w:r>
-        <w:rPr>
-          <w:bCs w:val="0"/>
-          <w:color w:val="000000" w:themeColor="text1"/>
-          <w14:shadow w14:blurRad="38100" w14:dist="19050" w14:dir="2700000" w14:sx="100000" w14:sy="100000" w14:kx="0" w14:ky="0" w14:algn="tl">
-            <w14:schemeClr w14:val="dk1">
-              <w14:alpha w14:val="60000"/>
-            </w14:schemeClr>
-          </w14:shadow>
-          <w14:textOutline w14:w="0" w14:cap="flat" w14:cmpd="sng" w14:algn="ctr">
-            <w14:noFill/>
-            <w14:prstDash w14:val="solid"/>
-            <w14:round/>
-          </w14:textOutline>
-        </w:rPr>
-        <w:t>3.2. Các khái niệm cốt lõi của Git</w:t>
-      </w:r>
-    </w:p>
-    <w:p>
-      <w:pPr>
-        <w:pStyle w:val="ListParagraph"/>
-        <w:numPr>
-          <w:ilvl w:val="0"/>
-          <w:numId w:val="2"/>
-        </w:numPr>
-        <w:spacing w:after="80"/>
-      </w:pPr>
-      <w:r>
-        <w:rPr>
-          <w:b/>
-          <w:bCs/>
-        </w:rPr>
-        <w:lastRenderedPageBreak/>
         <w:t>Repository (Repo):</w:t>
       </w:r>
       <w:r>
@@ -1039,7 +1010,7 @@
         <w:t>git init</w:t>
       </w:r>
       <w:r>
-        <w:t xml:space="preserve"> – Khởi tạo repository mới trong thư mục hiện tại.</w:t>
+        <w:t>– Khởi tạo repository mới trong thư mục hiện tại.</w:t>
       </w:r>
     </w:p>
     <w:p>
@@ -1529,7 +1500,6 @@
           <w:b/>
           <w:bCs/>
         </w:rPr>
-        <w:lastRenderedPageBreak/>
         <w:t>Đường cong học tập dốc:</w:t>
       </w:r>
       <w:r>

</xml_diff>